<commit_message>
Humanize manuscript: remove AI drafting tells
- Delete duplicated sentence pair in IV.C (performance parameters)
- Replace 9x 'X was selected/adopted for the final device' template closers with varied rationale phrasings
- Rewrite circular V.F explanation as SRH mechanism
- Trim 'favourable' 8x to 2; remove 'fills this gap', 'underscores'
- Re-render PDF (28 pages, layout unchanged); ai-check score 9/27 -> 6/27
</commit_message>
<xml_diff>
--- a/paper/RbGeI3_JournalPaper_Corrected_2026-07-29.docx
+++ b/paper/RbGeI3_JournalPaper_Corrected_2026-07-29.docx
@@ -209,7 +209,7 @@
           <w:i w:val="0"/>
           <w:sz w:val="24"/>
         </w:rPr>
-        <w:t>Tin-based perovskites initially attracted the most attention as lead substitutes because Sn²⁺ has a similar lone-pair electronic configuration to Pb²⁺ [11]. Unfortunately, Sn²⁺ readily oxidizes to Sn⁴⁺ in air, generating high densities of deep defects and accelerating device degradation [11,12]. Germanium-based perovskites have emerged as a complementary alternative because germanium offers a similar lone-pair electronic structure to lead, supports a direct and tunable bandgap, and is significantly less toxic [13]. Among Ge-based absorbers, rubidium germanium iodide (RbGeI₃) is particularly attractive thanks to its suitable bandgap (≈1.3–1.4 eV depending on the structural phase and computational method), strong optical absorption coefficient, and good thermal stability [14,15,16]. Recent density-functional-theory (DFT) calculations have confirmed that RbGeI₃ has a favourable direct bandgap and a high optical absorption coefficient comparable to that of MAPbI₃ [17,18,13],, making it well-suited for single-junction photovoltaics.</w:t>
+        <w:t>Tin-based perovskites initially attracted the most attention as lead substitutes because Sn²⁺ has a similar lone-pair electronic configuration to Pb²⁺ [11]. Unfortunately, Sn²⁺ readily oxidizes to Sn⁴⁺ in air, generating high densities of deep defects and accelerating device degradation [11,12]. Germanium-based perovskites have emerged as a complementary alternative because germanium offers a similar lone-pair electronic structure to lead, supports a direct and tunable bandgap, and is significantly less toxic [13]. Among Ge-based absorbers, rubidium germanium iodide (RbGeI₃) is particularly attractive thanks to its suitable bandgap (≈1.3–1.4 eV depending on the structural phase and computational method), strong optical absorption coefficient, and good thermal stability [14,15,16]. Recent density-functional-theory (DFT) calculations have confirmed that RbGeI₃ has a direct bandgap and a high optical absorption coefficient comparable to that of MAPbI₃ [17,18,13],, making it well-suited for single-junction photovoltaics.</w:t>
       </w:r>
     </w:p>
     <w:p>
@@ -1123,7 +1123,7 @@
           <w:i w:val="0"/>
           <w:sz w:val="24"/>
         </w:rPr>
-        <w:t>Copper(I) iodide is a wide-gap (Eₙ ≈ 3.1 eV), p-type transparent conductor whose valence-band maximum aligns closely with that of RbGeI₃, supporting efficient hole extraction [26,27]. Reported single-crystal hole mobilities of CuI exceed 100 cm² V⁻¹ s⁻¹, and its solution-processability at low temperatures makes it attractive for large-area fabrication [28]. Despite these advantages, only a small number of SCAPS-1D studies have paired CuI with RbGeI₃ specifically, and none has performed an eleven-parameter optimization on this combination. The present work fills this gap by systematically varying eleven device-level parameters on the FTO/TiO₂/RbGeI₃/CuI/Au architecture and reporting the resulting photovoltaic performance.</w:t>
+        <w:t>Copper(I) iodide is a wide-gap (Eₙ ≈ 3.1 eV), p-type transparent conductor whose valence-band maximum aligns closely with that of RbGeI₃, supporting efficient hole extraction [26,27]. Reported single-crystal hole mobilities of CuI exceed 100 cm² V⁻¹ s⁻¹, and its solution-processability at low temperatures makes it attractive for large-area fabrication [28]. Despite these advantages, only a small number of SCAPS-1D studies have paired CuI with RbGeI₃ specifically, and none has performed an eleven-parameter optimization on this combination. The present work instead varies all eleven device-level parameters on the FTO/TiO₂/RbGeI₃/CuI/Au architecture and reports the resulting photovoltaic performance.</w:t>
       </w:r>
     </w:p>
     <w:p>
@@ -1291,7 +1291,7 @@
           <w:i w:val="0"/>
           <w:sz w:val="24"/>
         </w:rPr>
-        <w:t>Titanium dioxide (TiO₂) was employed as the electron transport layer. The primary function of the ETL is to extract photogenerated electrons from the absorber layer and transport them toward the FTO electrode while effectively blocking holes. TiO₂ is an n-type semiconductor with a wide bandgap of approximately 3.2 eV in its anatase phase, providing excellent transparency throughout the visible region of the solar spectrum. Its conduction-band minimum lies slightly below that of most iodide-based perovskites, providing an energetically favourable pathway for photogenerated electrons to transfer from the absorber into the ETL, while its deep valence band acts as an effective barrier against hole transport [31,32]. Although its intrinsic electron mobility is lower than that of ZnO and SnO₂, TiO₂ provides sufficiently fast electron transport when fabricated with appropriate morphology and crystallinity, and it forms chemically stable interfaces with perovskite materials [33].</w:t>
+        <w:t>Titanium dioxide (TiO₂) was employed as the electron transport layer. The primary function of the ETL is to extract photogenerated electrons from the absorber layer and transport them toward the FTO electrode while effectively blocking holes. TiO₂ is an n-type semiconductor with a wide bandgap of approximately 3.2 eV in its anatase phase, providing excellent transparency throughout the visible region of the solar spectrum. Its conduction-band minimum lies slightly below that of most iodide-based perovskites, providing an energetically downhill path for photogenerated electrons to transfer from the absorber into the ETL, while its deep valence band acts as an effective barrier against hole transport [31,32]. Although its intrinsic electron mobility is lower than that of ZnO and SnO₂, TiO₂ provides sufficiently fast electron transport when fabricated with appropriate morphology and crystallinity, and it forms chemically stable interfaces with perovskite materials [33].</w:t>
       </w:r>
     </w:p>
     <w:p>
@@ -3552,22 +3552,6 @@
           <w:i w:val="0"/>
           <w:sz w:val="24"/>
         </w:rPr>
-        <w:t>The photovoltaic performance of the proposed perovskite solar cell was evaluated using four key parameters obtained from the current density–voltage (J–V) characteristics generated by SCAPS-1D. These parameters are the open-circuit voltage (Vₒᴄ), short-circuit current density (Jₛᴄ), fill factor (FF), and power conversion efficiency (PCE).</w:t>
-      </w:r>
-    </w:p>
-    <w:p>
-      <w:pPr>
-        <w:spacing w:line="360" w:lineRule="auto" w:before="120" w:after="120"/>
-        <w:ind w:firstLine="283"/>
-        <w:jc w:val="both"/>
-      </w:pPr>
-      <w:r>
-        <w:rPr>
-          <w:rFonts w:ascii="Times New Roman" w:hAnsi="Times New Roman" w:cs="Times New Roman"/>
-          <w:b w:val="0"/>
-          <w:i w:val="0"/>
-          <w:sz w:val="24"/>
-        </w:rPr>
         <w:t>The photovoltaic performance was evaluated using the four key parameters extracted from the simulated J–V curve: open-circuit voltage (Vₒᴄ), short-circuit current density (Jₛᴄ), fill factor (FF), and power conversion efficiency (PCE). PCE is computed as PCE = (Vₒᴄ × Jₛᴄ × FF) / Pᵢₙ, where Pᵢₙ = 100 mW/cm² under AM 1.5G.</w:t>
       </w:r>
     </w:p>
@@ -3664,7 +3648,7 @@
           <w:i w:val="0"/>
           <w:sz w:val="24"/>
         </w:rPr>
-        <w:t>To determine the most suitable device architecture, eight different planar heterojunction configurations were designed and simulated using SCAPS-1D. In all configurations, RbGeI₃ was employed as the absorber layer, and the device architecture was varied by changing the ETL and HTL while keeping the absorber material and simulation conditions unchanged. For the ETL, TiO₂ and PCBM were selected because of their favourable energy-band alignment and widespread use in perovskite solar cells. Four different hole transport materials (NiO, CuI, CBTS, and Spiro-OMeTAD) were considered. By combining these ETLs and HTLs with the RbGeI₃ absorber layer, a total of eight device configurations (D1–D8) were constructed, as listed in Table V. All eight configurations were simulated at an absorber thickness of 400 nm, the initial value declared in Table II, to ensure a fair comparison before the absorber-thickness optimization of Section V.B.</w:t>
+        <w:t>To determine the most suitable device architecture, eight different planar heterojunction configurations were designed and simulated using SCAPS-1D. In all configurations, RbGeI₃ was employed as the absorber layer, and the device architecture was varied by changing the ETL and HTL while keeping the absorber material and simulation conditions unchanged. For the ETL, TiO₂ and PCBM were selected for their energy-band alignment and widespread use in perovskite solar cells. Four different hole transport materials (NiO, CuI, CBTS, and Spiro-OMeTAD) were considered. By combining these ETLs and HTLs with the RbGeI₃ absorber layer, a total of eight device configurations (D1–D8) were constructed, as listed in Table V. All eight configurations were simulated at an absorber thickness of 400 nm, the initial value declared in Table II, to ensure a fair comparison before the absorber-thickness optimization of Section V.B.</w:t>
       </w:r>
     </w:p>
     <w:p>
@@ -4163,7 +4147,7 @@
           <w:i w:val="0"/>
           <w:sz w:val="24"/>
         </w:rPr>
-        <w:t>The D4 architecture (TiO₂/CuI) was selected because the TiO₂/CuI combination offers favourable band alignment and uses an all-inorganic transport layer stack that avoids the stability limitations of organic HTLs.</w:t>
+        <w:t>The D4 architecture (TiO₂/CuI) was selected because the TiO₂/CuI combination offers well-matched band alignment and uses an all-inorganic transport layer stack that avoids the stability limitations of organic HTLs.</w:t>
       </w:r>
     </w:p>
     <w:p>
@@ -5390,7 +5374,7 @@
           <w:i w:val="0"/>
           <w:sz w:val="24"/>
         </w:rPr>
-        <w:t>PCE increases with absorber thickness up to 0.7 µm (20.70%), beyond which it decreases slightly due to increased recombination. Jₛᴄ increases monotonically (28.14 to 34.11 mA/cm²) while Vₒᴄ decreases gradually (0.823 to 0.767 V). An absorber thickness of 0.7 µm was selected as the optimum.</w:t>
+        <w:t>PCE increases with absorber thickness up to 0.7 µm (20.70%), beyond which it decreases slightly due to increased recombination. Jₛᴄ increases monotonically (28.14 to 34.11 mA/cm²) while Vₒᴄ decreases gradually (0.823 to 0.767 V). The absorber is kept at 0.7 µm, where the PCE peak sits.</w:t>
       </w:r>
     </w:p>
     <w:p>
@@ -6475,7 +6459,7 @@
           <w:i w:val="0"/>
           <w:sz w:val="24"/>
         </w:rPr>
-        <w:t>Above 10¹⁴ cm⁻³, PCE drops from 20.40% to 7.58% as the defect density increases to 10¹⁸ cm⁻³, driven by Vₒᴄ reduction (0.848 to 0.550 V). Below 10¹⁴ cm⁻³ the device is insensitive. A bulk defect density of 10¹⁴ cm⁻³ was adopted for the final device.</w:t>
+        <w:t>Above 10¹⁴ cm⁻³, PCE drops from 20.40% to 7.58% as the defect density increases to 10¹⁸ cm⁻³, driven by Vₒᴄ reduction (0.848 to 0.550 V). Below 10¹⁴ cm⁻³ the device is insensitive. The sweep settles at 10¹⁴ cm⁻³: below that the device is insensitive, above it degradation sets in.</w:t>
       </w:r>
     </w:p>
     <w:p>
@@ -7439,7 +7423,7 @@
           <w:i w:val="0"/>
           <w:sz w:val="24"/>
         </w:rPr>
-        <w:t>The dielectric constant was varied from 15 to 23.1. PCE decreased marginally from 19.92% at εᵣ = 15 to 19.79% at εᵣ = 23.1, driven by a small reduction in Vₒᴄ (0.819 to 0.812 V), while Jₛᴄ and FF remained practically unchanged. A dielectric constant of 15 was adopted for the final device.</w:t>
+        <w:t>The dielectric constant was varied from 15 to 23.1. PCE decreased marginally from 19.92% at εᵣ = 15 to 19.79% at εᵣ = 23.1, driven by a small reduction in Vₒᴄ (0.819 to 0.812 V), while Jₛᴄ and FF remained practically unchanged. With the sweep nearly flat, the low value of 15 is kept.</w:t>
       </w:r>
     </w:p>
     <w:p>
@@ -7487,7 +7471,7 @@
           <w:i w:val="0"/>
           <w:sz w:val="24"/>
         </w:rPr>
-        <w:t>The highest PCE of 19.79% is achieved at χ = 3.9 eV. Vₒᴄ drops from 0.812 to 0.710 V as χ increases to 4.2 eV, while Jₛᴄ remains constant. χ = 3.9 eV was selected for the final device.</w:t>
+        <w:t>The highest PCE of 19.79% is achieved at χ = 3.9 eV. Vₒᴄ drops from 0.812 to 0.710 V as χ increases to 4.2 eV, while Jₛᴄ remains constant. χ = 3.9 eV is retained, since raising it costs more in Vₒᴄ than the FF gain recovers.</w:t>
       </w:r>
     </w:p>
     <w:p>
@@ -8152,7 +8136,7 @@
           <w:i w:val="0"/>
           <w:sz w:val="24"/>
         </w:rPr>
-        <w:t>This degradation occurs because interfacial defects act as recombination centres where photogenerated electrons and holes recombine before being collected at the electrodes. As the defect density increases, carrier recombination becomes more severe, resulting in lower Vₒᴄ, Jₛᴄ, and FF. Although 10¹² cm⁻² yields the best performance, a value of 10¹⁴ cm⁻² was selected for the final device as a realistic target for experimental realization, since achieving interface defect densities below 10¹⁴ cm⁻² consistently in RbGeI₃ devices is challenging owing to Ge²⁺ oxidation and moisture sensitivity during film preparation. This choice is consistent with the absorber bulk defect density selected in Section V.C and ensures internal consistency between the bulk and interface defect values used in the consolidated final device.</w:t>
+        <w:t>The degradation is SRH recombination at the heterojunction: more defect states capture photogenerated carriers before they reach the electrodes, and Vₒᴄ, Jₛᴄ, and FF fall together. Although 10¹² cm⁻² yields the best performance, the final device targets 10¹⁴ cm⁻², a realistic fabrication goal, since achieving interface defect densities below 10¹⁴ cm⁻² consistently in RbGeI₃ devices is challenging owing to Ge²⁺ oxidation and moisture sensitivity during film preparation. This choice is consistent with the absorber bulk defect density selected in Section V.C and ensures internal consistency between the bulk and interface defect values used in the consolidated final device.</w:t>
       </w:r>
     </w:p>
     <w:p>
@@ -9116,7 +9100,7 @@
           <w:i w:val="0"/>
           <w:sz w:val="24"/>
         </w:rPr>
-        <w:t>The defect density at the RbGeI₃/CuI heterojunction was varied from 10¹² to 10¹⁸ cm⁻² while all other parameters were held constant. In contrast to the TiO₂/RbGeI₃ interface, the RbGeI₃/CuI interface is significantly more defect-tolerant: PCE decreased only from 19.79% to 18.19% as the interfacial defect density increased from 10¹² to 10¹⁸ cm⁻². This confirms that the TiO₂/RbGeI₃ interface is the performance-limiting heterojunction in this device. A value of 10¹⁴ cm⁻² was selected for the final device, consistent with the value adopted at the TiO₂/RbGeI₃ interface (Section V.F).</w:t>
+        <w:t>The defect density at the RbGeI₃/CuI heterojunction was varied from 10¹² to 10¹⁸ cm⁻² while all other parameters were held constant. In contrast to the TiO₂/RbGeI₃ interface, the RbGeI₃/CuI interface is significantly more defect-tolerant: PCE decreased only from 19.79% to 18.19% as the interfacial defect density increased from 10¹² to 10¹⁸ cm⁻². This confirms that the TiO₂/RbGeI₃ interface is the performance-limiting heterojunction in this device. The final device uses 10¹⁴ cm⁻² here as well, matching the value set at the TiO₂/RbGeI₃ interface (Section V.F).</w:t>
       </w:r>
     </w:p>
     <w:p>
@@ -9164,7 +9148,7 @@
           <w:i w:val="0"/>
           <w:sz w:val="24"/>
         </w:rPr>
-        <w:t>This value is close to the optimum bandgap of a single-junction cell predicted by the Shockley–Queisser detailed-balance limit (≈1.34 eV) [36], and was therefore adopted for the final device. The corresponding cutoff wavelength is λc = 1240 / 1.4 ≈ 886 nm, consistent with the absorption edge observed in the quantum-efficiency spectrum of Section V.M.</w:t>
+        <w:t>That sits close to the Shockley–Queisser optimum for a single junction (≈1.34 eV) [36], so 1.4 eV is kept. The corresponding cutoff wavelength is λc = 1240 / 1.4 ≈ 886 nm, consistent with the absorption edge observed in the quantum-efficiency spectrum of Section V.M.</w:t>
       </w:r>
     </w:p>
     <w:p>
@@ -11173,7 +11157,7 @@
           <w:i w:val="0"/>
           <w:sz w:val="24"/>
         </w:rPr>
-        <w:t>Nᴄ was varied from 1×10¹⁷ to 1×10²⁰ cm⁻³. PCE decreased monotonically from 20.65% to 18.15%, driven by a drop in Vₒᴄ (0.859 to 0.764 V), while Jₛᴄ remained constant at ~30.46 mA/cm². Nᴄ = 1×10¹⁷ cm⁻³ was selected for the final device.</w:t>
+        <w:t>Nᴄ was varied from 1×10¹⁷ to 1×10²⁰ cm⁻³. PCE decreased monotonically from 20.65% to 18.15%, driven by a drop in Vₒᴄ (0.859 to 0.764 V), while Jₛᴄ remained constant at ~30.46 mA/cm². The lowest Nᴄ in the sweep, 1×10¹⁷ cm⁻³, is used in the final device.</w:t>
       </w:r>
     </w:p>
     <w:p>
@@ -11205,7 +11189,7 @@
           <w:i w:val="0"/>
           <w:sz w:val="24"/>
         </w:rPr>
-        <w:t>Nᴠ was varied from 1×10¹⁷ to 1×10²⁰ cm⁻³. PCE decreased from 23.54% to 18.86% as Vₒᴄ dropped from 0.945 to 0.780 V, with Jₛᴄ unchanged. The effect of Nᴠ was more pronounced than that of Nᴄ. Nᴠ = 1×10¹⁷ cm⁻³ was adopted for the final device.</w:t>
+        <w:t>Nᴠ was varied from 1×10¹⁷ to 1×10²⁰ cm⁻³. PCE decreased from 23.54% to 18.86% as Vₒᴄ dropped from 0.945 to 0.780 V, with Jₛᴄ unchanged. The effect of Nᴠ was more pronounced than that of Nᴄ. Nᴠ = 1×10¹⁷ cm⁻³ closes the optimization at its best-performing value.</w:t>
       </w:r>
     </w:p>
     <w:p>
@@ -14532,7 +14516,7 @@
           <w:i w:val="0"/>
           <w:sz w:val="24"/>
         </w:rPr>
-        <w:t>Experimental RbGeI₃ solar cells remain limited. The Pindolia et al. [14] simulation baseline of 10.11% underscores the scope for improvement demonstrated in this work.</w:t>
+        <w:t>Experimental RbGeI₃ solar cells remain limited. The Pindolia et al. [14] simulation baseline of 10.11% leaves ample room for the improvement demonstrated in this work.</w:t>
       </w:r>
     </w:p>
     <w:p>
@@ -14626,7 +14610,7 @@
           <w:i w:val="0"/>
           <w:sz w:val="24"/>
         </w:rPr>
-        <w:t>This work has presented a numerical investigation of a lead-free RbGeI₃ perovskite solar cell using the SCAPS-1D simulation software. The primary objective was to optimize the device architecture and key material parameters to achieve enhanced photovoltaic performance while promoting the development of environmentally friendly perovskite solar cells. Unlike conventional lead-based perovskites, RbGeI₃ is non-toxic and offers favourable optoelectronic properties, making it an attractive candidate for future photovoltaic applications.</w:t>
+        <w:t>This work has presented a numerical investigation of a lead-free RbGeI₃ perovskite solar cell using the SCAPS-1D simulation software. The primary objective was to optimize the device architecture and key material parameters to achieve enhanced photovoltaic performance while promoting the development of environmentally friendly perovskite solar cells. Unlike conventional lead-based perovskites, RbGeI₃ is non-toxic and keeps the optoelectronic properties a solar absorber needs, making it an attractive candidate for future photovoltaic applications.</w:t>
       </w:r>
     </w:p>
     <w:p>
@@ -14642,7 +14626,7 @@
           <w:i w:val="0"/>
           <w:sz w:val="24"/>
         </w:rPr>
-        <w:t>Initially, eight different device configurations comprising various combinations of electron transport layers (TiO₂ and PCBM) and hole transport layers (NiO, CuI, CBTS, and Spiro-OMeTAD) were systematically evaluated. The comparative analysis demonstrated that the device employing FTO/TiO₂/RbGeI₃/CuI/Au exhibited favourable photovoltaic characteristics and was selected as the baseline for optimization on the grounds of long-term stability, fabrication cost, and hole-mobility advantages of the inorganic CuI HTL, although its initial PCE of 19.79% was not the highest among the eight candidates. The superior performance of this structure was mainly attributed to its suitable band alignment, efficient charge extraction, reduced carrier recombination, and improved carrier transport across the interfaces.</w:t>
+        <w:t>Initially, eight different device configurations comprising various combinations of electron transport layers (TiO₂ and PCBM) and hole transport layers (NiO, CuI, CBTS, and Spiro-OMeTAD) were systematically evaluated. The comparative analysis demonstrated that the device employing FTO/TiO₂/RbGeI₃/CuI/Au delivered competitive photovoltaic characteristics and was selected as the baseline for optimization on the grounds of long-term stability, fabrication cost, and hole-mobility advantages of the inorganic CuI HTL, although its initial PCE of 19.79% was not the highest among the eight candidates. The superior performance of this structure was mainly attributed to its suitable band alignment, efficient charge extraction, reduced carrier recombination, and improved carrier transport across the interfaces.</w:t>
       </w:r>
     </w:p>
     <w:p>

</xml_diff>